<commit_message>
Persist customer conversations into frontline workspace
</commit_message>
<xml_diff>
--- a/docs/ServicePilot_PRD_v1.0.docx
+++ b/docs/ServicePilot_PRD_v1.0.docx
@@ -64,7 +64,7 @@
           <w:color w:val="59636E"/>
           <w:sz w:val="20"/>
         </w:rPr>
-        <w:t>V1.0 - 当前原型基线</w:t>
+        <w:t>V1.1 - 真实客服闭环增量</w:t>
       </w:r>
     </w:p>
     <w:p>
@@ -156,7 +156,7 @@
           <w:color w:val="59636E"/>
           <w:sz w:val="20"/>
         </w:rPr>
-        <w:t>2026-08-14</w:t>
+        <w:t>2026-08-17</w:t>
       </w:r>
     </w:p>
     <w:p>
@@ -503,7 +503,7 @@
           <w:rFonts w:ascii="SimHei" w:hAnsi="SimHei" w:eastAsia="SimHei"/>
           <w:sz w:val="22"/>
         </w:rPr>
-        <w:t>原型已实现角色登录选择、会话与工单协作、已发布知识引用、知识运营的测试/复核/灰度流程、质检评测、策略配置、权限与审计页面。当前工作台指标和部分审批状态为演示交互，尚不代表真实后端审批、策略发布或生产数据写回。</w:t>
+        <w:t>原型已实现角色登录选择、会话与工单协作、已发布知识引用、知识运营的测试/复核/灰度流程、质检评测、策略配置、权限与审计页面。本次增量将体验用户端的提问、Agent 回复、知识引用、会话状态和转人工任务写入持久化数据，并让客服工作台从数据库读取和更新会话。工作台指标和部分审批状态仍不代表完整生产数据。</w:t>
       </w:r>
     </w:p>
     <w:p>
@@ -1888,6 +1888,168 @@
           </w:p>
         </w:tc>
       </w:tr>
+      <w:tr>
+        <w:trPr>
+          <w:cantSplit w:val="true"/>
+        </w:trPr>
+        <w:tc>
+          <w:tcPr>
+            <w:tcW w:type="dxa" w:w="850"/>
+          </w:tcPr>
+          <w:p>
+            <w:pPr>
+              <w:spacing w:before="0" w:after="0" w:line="252" w:lineRule="auto"/>
+            </w:pPr>
+            <w:r/>
+            <w:r>
+              <w:rPr>
+                <w:rFonts w:ascii="SimHei" w:hAnsi="SimHei" w:eastAsia="SimHei"/>
+                <w:b w:val="0"/>
+                <w:sz w:val="18"/>
+              </w:rPr>
+              <w:t>FR-04</w:t>
+            </w:r>
+          </w:p>
+        </w:tc>
+        <w:tc>
+          <w:tcPr>
+            <w:tcW w:type="dxa" w:w="3700"/>
+          </w:tcPr>
+          <w:p>
+            <w:pPr>
+              <w:spacing w:before="0" w:after="0" w:line="252" w:lineRule="auto"/>
+            </w:pPr>
+            <w:r/>
+            <w:r>
+              <w:rPr>
+                <w:rFonts w:ascii="SimHei" w:hAnsi="SimHei" w:eastAsia="SimHei"/>
+                <w:b w:val="0"/>
+                <w:sz w:val="18"/>
+              </w:rPr>
+              <w:t>消费者端真实提问创建可追溯会话，并保存用户消息、Agent 回复、知识引用和处理轨迹。</w:t>
+            </w:r>
+          </w:p>
+        </w:tc>
+        <w:tc>
+          <w:tcPr>
+            <w:tcW w:type="dxa" w:w="700"/>
+          </w:tcPr>
+          <w:p>
+            <w:pPr>
+              <w:spacing w:before="0" w:after="0" w:line="252" w:lineRule="auto"/>
+            </w:pPr>
+            <w:r/>
+            <w:r>
+              <w:rPr>
+                <w:rFonts w:ascii="SimHei" w:hAnsi="SimHei" w:eastAsia="SimHei"/>
+                <w:b w:val="0"/>
+                <w:sz w:val="18"/>
+              </w:rPr>
+              <w:t>P0</w:t>
+            </w:r>
+          </w:p>
+        </w:tc>
+        <w:tc>
+          <w:tcPr>
+            <w:tcW w:type="dxa" w:w="4110"/>
+          </w:tcPr>
+          <w:p>
+            <w:pPr>
+              <w:spacing w:before="0" w:after="0" w:line="252" w:lineRule="auto"/>
+            </w:pPr>
+            <w:r/>
+            <w:r>
+              <w:rPr>
+                <w:rFonts w:ascii="SimHei" w:hAnsi="SimHei" w:eastAsia="SimHei"/>
+                <w:b w:val="0"/>
+                <w:sz w:val="18"/>
+              </w:rPr>
+              <w:t>每次请求写入会话与消息；响应返回会话编号；不会只停留在前端状态。</w:t>
+            </w:r>
+          </w:p>
+        </w:tc>
+      </w:tr>
+      <w:tr>
+        <w:trPr>
+          <w:cantSplit w:val="true"/>
+        </w:trPr>
+        <w:tc>
+          <w:tcPr>
+            <w:tcW w:type="dxa" w:w="850"/>
+          </w:tcPr>
+          <w:p>
+            <w:pPr>
+              <w:spacing w:before="0" w:after="0" w:line="252" w:lineRule="auto"/>
+            </w:pPr>
+            <w:r/>
+            <w:r>
+              <w:rPr>
+                <w:rFonts w:ascii="SimHei" w:hAnsi="SimHei" w:eastAsia="SimHei"/>
+                <w:b w:val="0"/>
+                <w:sz w:val="18"/>
+              </w:rPr>
+              <w:t>FR-05</w:t>
+            </w:r>
+          </w:p>
+        </w:tc>
+        <w:tc>
+          <w:tcPr>
+            <w:tcW w:type="dxa" w:w="3700"/>
+          </w:tcPr>
+          <w:p>
+            <w:pPr>
+              <w:spacing w:before="0" w:after="0" w:line="252" w:lineRule="auto"/>
+            </w:pPr>
+            <w:r/>
+            <w:r>
+              <w:rPr>
+                <w:rFonts w:ascii="SimHei" w:hAnsi="SimHei" w:eastAsia="SimHei"/>
+                <w:b w:val="0"/>
+                <w:sz w:val="18"/>
+              </w:rPr>
+              <w:t>Agent 对低置信度、高风险或规则要求的请求生成转人工任务。</w:t>
+            </w:r>
+          </w:p>
+        </w:tc>
+        <w:tc>
+          <w:tcPr>
+            <w:tcW w:type="dxa" w:w="700"/>
+          </w:tcPr>
+          <w:p>
+            <w:pPr>
+              <w:spacing w:before="0" w:after="0" w:line="252" w:lineRule="auto"/>
+            </w:pPr>
+            <w:r/>
+            <w:r>
+              <w:rPr>
+                <w:rFonts w:ascii="SimHei" w:hAnsi="SimHei" w:eastAsia="SimHei"/>
+                <w:b w:val="0"/>
+                <w:sz w:val="18"/>
+              </w:rPr>
+              <w:t>P0</w:t>
+            </w:r>
+          </w:p>
+        </w:tc>
+        <w:tc>
+          <w:tcPr>
+            <w:tcW w:type="dxa" w:w="4110"/>
+          </w:tcPr>
+          <w:p>
+            <w:pPr>
+              <w:spacing w:before="0" w:after="0" w:line="252" w:lineRule="auto"/>
+            </w:pPr>
+            <w:r/>
+            <w:r>
+              <w:rPr>
+                <w:rFonts w:ascii="SimHei" w:hAnsi="SimHei" w:eastAsia="SimHei"/>
+                <w:b w:val="0"/>
+                <w:sz w:val="18"/>
+              </w:rPr>
+              <w:t>会话状态变为待接管；客服刷新或轮询后能看到用户原问、AI 回复、依据和摘要。</w:t>
+            </w:r>
+          </w:p>
+        </w:tc>
+      </w:tr>
     </w:tbl>
     <w:p>
       <w:pPr>
@@ -2436,6 +2598,87 @@
                 <w:sz w:val="18"/>
               </w:rPr>
               <w:t>搜索结果仅返回 active 知识；引用时记录知识编号与版本；无编辑、审核、发布入口。</w:t>
+            </w:r>
+          </w:p>
+        </w:tc>
+      </w:tr>
+      <w:tr>
+        <w:trPr>
+          <w:cantSplit w:val="true"/>
+        </w:trPr>
+        <w:tc>
+          <w:tcPr>
+            <w:tcW w:type="dxa" w:w="850"/>
+          </w:tcPr>
+          <w:p>
+            <w:pPr>
+              <w:spacing w:before="0" w:after="0" w:line="252" w:lineRule="auto"/>
+            </w:pPr>
+            <w:r/>
+            <w:r>
+              <w:rPr>
+                <w:rFonts w:ascii="SimHei" w:hAnsi="SimHei" w:eastAsia="SimHei"/>
+                <w:b w:val="0"/>
+                <w:sz w:val="18"/>
+              </w:rPr>
+              <w:t>FR-15</w:t>
+            </w:r>
+          </w:p>
+        </w:tc>
+        <w:tc>
+          <w:tcPr>
+            <w:tcW w:type="dxa" w:w="3700"/>
+          </w:tcPr>
+          <w:p>
+            <w:pPr>
+              <w:spacing w:before="0" w:after="0" w:line="252" w:lineRule="auto"/>
+            </w:pPr>
+            <w:r/>
+            <w:r>
+              <w:rPr>
+                <w:rFonts w:ascii="SimHei" w:hAnsi="SimHei" w:eastAsia="SimHei"/>
+                <w:b w:val="0"/>
+                <w:sz w:val="18"/>
+              </w:rPr>
+              <w:t>客服接管、发送人工回复、结案和重新打开均持久化，并写入审计事件。</w:t>
+            </w:r>
+          </w:p>
+        </w:tc>
+        <w:tc>
+          <w:tcPr>
+            <w:tcW w:type="dxa" w:w="700"/>
+          </w:tcPr>
+          <w:p>
+            <w:pPr>
+              <w:spacing w:before="0" w:after="0" w:line="252" w:lineRule="auto"/>
+            </w:pPr>
+            <w:r/>
+            <w:r>
+              <w:rPr>
+                <w:rFonts w:ascii="SimHei" w:hAnsi="SimHei" w:eastAsia="SimHei"/>
+                <w:b w:val="0"/>
+                <w:sz w:val="18"/>
+              </w:rPr>
+              <w:t>P0</w:t>
+            </w:r>
+          </w:p>
+        </w:tc>
+        <w:tc>
+          <w:tcPr>
+            <w:tcW w:type="dxa" w:w="4110"/>
+          </w:tcPr>
+          <w:p>
+            <w:pPr>
+              <w:spacing w:before="0" w:after="0" w:line="252" w:lineRule="auto"/>
+            </w:pPr>
+            <w:r/>
+            <w:r>
+              <w:rPr>
+                <w:rFonts w:ascii="SimHei" w:hAnsi="SimHei" w:eastAsia="SimHei"/>
+                <w:b w:val="0"/>
+                <w:sz w:val="18"/>
+              </w:rPr>
+              <w:t>刷新页面后状态与消息仍保留；接管和结案不依赖前端内存。</w:t>
             </w:r>
           </w:p>
         </w:tc>
@@ -5972,6 +6215,87 @@
           </w:p>
         </w:tc>
       </w:tr>
+      <w:tr>
+        <w:trPr>
+          <w:cantSplit w:val="true"/>
+        </w:trPr>
+        <w:tc>
+          <w:tcPr>
+            <w:tcW w:type="dxa" w:w="1200"/>
+          </w:tcPr>
+          <w:p>
+            <w:pPr>
+              <w:spacing w:before="0" w:after="0" w:line="252" w:lineRule="auto"/>
+            </w:pPr>
+            <w:r/>
+            <w:r>
+              <w:rPr>
+                <w:rFonts w:ascii="SimHei" w:hAnsi="SimHei" w:eastAsia="SimHei"/>
+                <w:b w:val="0"/>
+                <w:sz w:val="18"/>
+              </w:rPr>
+              <w:t>V1.1</w:t>
+            </w:r>
+          </w:p>
+        </w:tc>
+        <w:tc>
+          <w:tcPr>
+            <w:tcW w:type="dxa" w:w="1500"/>
+          </w:tcPr>
+          <w:p>
+            <w:pPr>
+              <w:spacing w:before="0" w:after="0" w:line="252" w:lineRule="auto"/>
+            </w:pPr>
+            <w:r/>
+            <w:r>
+              <w:rPr>
+                <w:rFonts w:ascii="SimHei" w:hAnsi="SimHei" w:eastAsia="SimHei"/>
+                <w:b w:val="0"/>
+                <w:sz w:val="18"/>
+              </w:rPr>
+              <w:t>2026-08-17</w:t>
+            </w:r>
+          </w:p>
+        </w:tc>
+        <w:tc>
+          <w:tcPr>
+            <w:tcW w:type="dxa" w:w="5160"/>
+          </w:tcPr>
+          <w:p>
+            <w:pPr>
+              <w:spacing w:before="0" w:after="0" w:line="252" w:lineRule="auto"/>
+            </w:pPr>
+            <w:r/>
+            <w:r>
+              <w:rPr>
+                <w:rFonts w:ascii="SimHei" w:hAnsi="SimHei" w:eastAsia="SimHei"/>
+                <w:b w:val="0"/>
+                <w:sz w:val="18"/>
+              </w:rPr>
+              <w:t>将体验用户提问、Agent 处理、转人工队列和客服接管/回复/结案接入持久化会话与消息。</w:t>
+            </w:r>
+          </w:p>
+        </w:tc>
+        <w:tc>
+          <w:tcPr>
+            <w:tcW w:type="dxa" w:w="1500"/>
+          </w:tcPr>
+          <w:p>
+            <w:pPr>
+              <w:spacing w:before="0" w:after="0" w:line="252" w:lineRule="auto"/>
+            </w:pPr>
+            <w:r/>
+            <w:r>
+              <w:rPr>
+                <w:rFonts w:ascii="SimHei" w:hAnsi="SimHei" w:eastAsia="SimHei"/>
+                <w:b w:val="0"/>
+                <w:sz w:val="18"/>
+              </w:rPr>
+              <w:t>已更新</w:t>
+            </w:r>
+          </w:p>
+        </w:tc>
+      </w:tr>
     </w:tbl>
     <w:p>
       <w:pPr>
@@ -6067,7 +6391,7 @@
         <w:color w:val="59636E"/>
         <w:sz w:val="17"/>
       </w:rPr>
-      <w:t>内部工作稿 | 2026-08-14</w:t>
+      <w:t>内部工作稿 | 2026-08-17</w:t>
     </w:r>
   </w:p>
 </w:ftr>

</xml_diff>